<commit_message>
Use bold top and bottom table rules
Top and bottom rules are now 2.25 pt; the header rule stays 1 pt.
Nothing else changed.

Co-Authored-By: Claude Opus 5.5 <noreply@anthropic.com>
Claude-Session: https://claude.ai/code/session_01C1Wc1jV47ZKpF3eVzF9mCX
</commit_message>
<xml_diff>
--- a/Tables_for_manuscript_formatted.docx
+++ b/Tables_for_manuscript_formatted.docx
@@ -49,7 +49,7 @@
           <w:tcPr>
             <w:tcW w:type="dxa" w:w="1139"/>
             <w:tcBorders>
-              <w:top w:val="single" w:sz="8" w:space="0" w:color="000000"/>
+              <w:top w:val="single" w:sz="18" w:space="0" w:color="000000"/>
               <w:left w:val="nil"/>
               <w:bottom w:val="single" w:sz="8" w:space="0" w:color="000000"/>
               <w:right w:val="nil"/>
@@ -76,7 +76,7 @@
           <w:tcPr>
             <w:tcW w:type="dxa" w:w="839"/>
             <w:tcBorders>
-              <w:top w:val="single" w:sz="8" w:space="0" w:color="000000"/>
+              <w:top w:val="single" w:sz="18" w:space="0" w:color="000000"/>
               <w:left w:val="nil"/>
               <w:bottom w:val="single" w:sz="8" w:space="0" w:color="000000"/>
               <w:right w:val="nil"/>
@@ -103,7 +103,7 @@
           <w:tcPr>
             <w:tcW w:type="dxa" w:w="895"/>
             <w:tcBorders>
-              <w:top w:val="single" w:sz="8" w:space="0" w:color="000000"/>
+              <w:top w:val="single" w:sz="18" w:space="0" w:color="000000"/>
               <w:left w:val="nil"/>
               <w:bottom w:val="single" w:sz="8" w:space="0" w:color="000000"/>
               <w:right w:val="nil"/>
@@ -130,7 +130,7 @@
           <w:tcPr>
             <w:tcW w:type="dxa" w:w="1456"/>
             <w:tcBorders>
-              <w:top w:val="single" w:sz="8" w:space="0" w:color="000000"/>
+              <w:top w:val="single" w:sz="18" w:space="0" w:color="000000"/>
               <w:left w:val="nil"/>
               <w:bottom w:val="single" w:sz="8" w:space="0" w:color="000000"/>
               <w:right w:val="nil"/>
@@ -157,7 +157,7 @@
           <w:tcPr>
             <w:tcW w:type="dxa" w:w="1045"/>
             <w:tcBorders>
-              <w:top w:val="single" w:sz="8" w:space="0" w:color="000000"/>
+              <w:top w:val="single" w:sz="18" w:space="0" w:color="000000"/>
               <w:left w:val="nil"/>
               <w:bottom w:val="single" w:sz="8" w:space="0" w:color="000000"/>
               <w:right w:val="nil"/>
@@ -184,7 +184,7 @@
           <w:tcPr>
             <w:tcW w:type="dxa" w:w="1262"/>
             <w:tcBorders>
-              <w:top w:val="single" w:sz="8" w:space="0" w:color="000000"/>
+              <w:top w:val="single" w:sz="18" w:space="0" w:color="000000"/>
               <w:left w:val="nil"/>
               <w:bottom w:val="single" w:sz="8" w:space="0" w:color="000000"/>
               <w:right w:val="nil"/>
@@ -211,7 +211,7 @@
           <w:tcPr>
             <w:tcW w:type="dxa" w:w="1495"/>
             <w:tcBorders>
-              <w:top w:val="single" w:sz="8" w:space="0" w:color="000000"/>
+              <w:top w:val="single" w:sz="18" w:space="0" w:color="000000"/>
               <w:left w:val="nil"/>
               <w:bottom w:val="single" w:sz="8" w:space="0" w:color="000000"/>
               <w:right w:val="nil"/>
@@ -238,7 +238,7 @@
           <w:tcPr>
             <w:tcW w:type="dxa" w:w="1229"/>
             <w:tcBorders>
-              <w:top w:val="single" w:sz="8" w:space="0" w:color="000000"/>
+              <w:top w:val="single" w:sz="18" w:space="0" w:color="000000"/>
               <w:left w:val="nil"/>
               <w:bottom w:val="single" w:sz="8" w:space="0" w:color="000000"/>
               <w:right w:val="nil"/>
@@ -1598,7 +1598,7 @@
             <w:tcBorders>
               <w:top w:val="nil"/>
               <w:left w:val="nil"/>
-              <w:bottom w:val="single" w:sz="8" w:space="0" w:color="000000"/>
+              <w:bottom w:val="single" w:sz="18" w:space="0" w:color="000000"/>
               <w:right w:val="nil"/>
             </w:tcBorders>
             <w:vAlign w:val="top"/>
@@ -1625,7 +1625,7 @@
             <w:tcBorders>
               <w:top w:val="nil"/>
               <w:left w:val="nil"/>
-              <w:bottom w:val="single" w:sz="8" w:space="0" w:color="000000"/>
+              <w:bottom w:val="single" w:sz="18" w:space="0" w:color="000000"/>
               <w:right w:val="nil"/>
             </w:tcBorders>
             <w:vAlign w:val="top"/>
@@ -1652,7 +1652,7 @@
             <w:tcBorders>
               <w:top w:val="nil"/>
               <w:left w:val="nil"/>
-              <w:bottom w:val="single" w:sz="8" w:space="0" w:color="000000"/>
+              <w:bottom w:val="single" w:sz="18" w:space="0" w:color="000000"/>
               <w:right w:val="nil"/>
             </w:tcBorders>
             <w:vAlign w:val="top"/>
@@ -1679,7 +1679,7 @@
             <w:tcBorders>
               <w:top w:val="nil"/>
               <w:left w:val="nil"/>
-              <w:bottom w:val="single" w:sz="8" w:space="0" w:color="000000"/>
+              <w:bottom w:val="single" w:sz="18" w:space="0" w:color="000000"/>
               <w:right w:val="nil"/>
             </w:tcBorders>
             <w:vAlign w:val="top"/>
@@ -1706,7 +1706,7 @@
             <w:tcBorders>
               <w:top w:val="nil"/>
               <w:left w:val="nil"/>
-              <w:bottom w:val="single" w:sz="8" w:space="0" w:color="000000"/>
+              <w:bottom w:val="single" w:sz="18" w:space="0" w:color="000000"/>
               <w:right w:val="nil"/>
             </w:tcBorders>
             <w:vAlign w:val="top"/>
@@ -1733,7 +1733,7 @@
             <w:tcBorders>
               <w:top w:val="nil"/>
               <w:left w:val="nil"/>
-              <w:bottom w:val="single" w:sz="8" w:space="0" w:color="000000"/>
+              <w:bottom w:val="single" w:sz="18" w:space="0" w:color="000000"/>
               <w:right w:val="nil"/>
             </w:tcBorders>
             <w:vAlign w:val="top"/>
@@ -1760,7 +1760,7 @@
             <w:tcBorders>
               <w:top w:val="nil"/>
               <w:left w:val="nil"/>
-              <w:bottom w:val="single" w:sz="8" w:space="0" w:color="000000"/>
+              <w:bottom w:val="single" w:sz="18" w:space="0" w:color="000000"/>
               <w:right w:val="nil"/>
             </w:tcBorders>
             <w:vAlign w:val="top"/>
@@ -1787,7 +1787,7 @@
             <w:tcBorders>
               <w:top w:val="nil"/>
               <w:left w:val="nil"/>
-              <w:bottom w:val="single" w:sz="8" w:space="0" w:color="000000"/>
+              <w:bottom w:val="single" w:sz="18" w:space="0" w:color="000000"/>
               <w:right w:val="nil"/>
             </w:tcBorders>
             <w:vAlign w:val="top"/>
@@ -1869,7 +1869,7 @@
           <w:tcPr>
             <w:tcW w:type="dxa" w:w="1772"/>
             <w:tcBorders>
-              <w:top w:val="single" w:sz="8" w:space="0" w:color="000000"/>
+              <w:top w:val="single" w:sz="18" w:space="0" w:color="000000"/>
               <w:left w:val="nil"/>
               <w:bottom w:val="single" w:sz="8" w:space="0" w:color="000000"/>
               <w:right w:val="nil"/>
@@ -1896,7 +1896,7 @@
           <w:tcPr>
             <w:tcW w:type="dxa" w:w="1472"/>
             <w:tcBorders>
-              <w:top w:val="single" w:sz="8" w:space="0" w:color="000000"/>
+              <w:top w:val="single" w:sz="18" w:space="0" w:color="000000"/>
               <w:left w:val="nil"/>
               <w:bottom w:val="single" w:sz="8" w:space="0" w:color="000000"/>
               <w:right w:val="nil"/>
@@ -1923,7 +1923,7 @@
           <w:tcPr>
             <w:tcW w:type="dxa" w:w="1639"/>
             <w:tcBorders>
-              <w:top w:val="single" w:sz="8" w:space="0" w:color="000000"/>
+              <w:top w:val="single" w:sz="18" w:space="0" w:color="000000"/>
               <w:left w:val="nil"/>
               <w:bottom w:val="single" w:sz="8" w:space="0" w:color="000000"/>
               <w:right w:val="nil"/>
@@ -1950,7 +1950,7 @@
           <w:tcPr>
             <w:tcW w:type="dxa" w:w="1758"/>
             <w:tcBorders>
-              <w:top w:val="single" w:sz="8" w:space="0" w:color="000000"/>
+              <w:top w:val="single" w:sz="18" w:space="0" w:color="000000"/>
               <w:left w:val="nil"/>
               <w:bottom w:val="single" w:sz="8" w:space="0" w:color="000000"/>
               <w:right w:val="nil"/>
@@ -1977,7 +1977,7 @@
           <w:tcPr>
             <w:tcW w:type="dxa" w:w="1200"/>
             <w:tcBorders>
-              <w:top w:val="single" w:sz="8" w:space="0" w:color="000000"/>
+              <w:top w:val="single" w:sz="18" w:space="0" w:color="000000"/>
               <w:left w:val="nil"/>
               <w:bottom w:val="single" w:sz="8" w:space="0" w:color="000000"/>
               <w:right w:val="nil"/>
@@ -2012,7 +2012,7 @@
           <w:tcPr>
             <w:tcW w:type="dxa" w:w="895"/>
             <w:tcBorders>
-              <w:top w:val="single" w:sz="8" w:space="0" w:color="000000"/>
+              <w:top w:val="single" w:sz="18" w:space="0" w:color="000000"/>
               <w:left w:val="nil"/>
               <w:bottom w:val="single" w:sz="8" w:space="0" w:color="000000"/>
               <w:right w:val="nil"/>
@@ -2039,7 +2039,7 @@
           <w:tcPr>
             <w:tcW w:type="dxa" w:w="1073"/>
             <w:tcBorders>
-              <w:top w:val="single" w:sz="8" w:space="0" w:color="000000"/>
+              <w:top w:val="single" w:sz="18" w:space="0" w:color="000000"/>
               <w:left w:val="nil"/>
               <w:bottom w:val="single" w:sz="8" w:space="0" w:color="000000"/>
               <w:right w:val="nil"/>
@@ -2066,7 +2066,7 @@
           <w:tcPr>
             <w:tcW w:type="dxa" w:w="962"/>
             <w:tcBorders>
-              <w:top w:val="single" w:sz="8" w:space="0" w:color="000000"/>
+              <w:top w:val="single" w:sz="18" w:space="0" w:color="000000"/>
               <w:left w:val="nil"/>
               <w:bottom w:val="single" w:sz="8" w:space="0" w:color="000000"/>
               <w:right w:val="nil"/>
@@ -2093,7 +2093,7 @@
           <w:tcPr>
             <w:tcW w:type="dxa" w:w="906"/>
             <w:tcBorders>
-              <w:top w:val="single" w:sz="8" w:space="0" w:color="000000"/>
+              <w:top w:val="single" w:sz="18" w:space="0" w:color="000000"/>
               <w:left w:val="nil"/>
               <w:bottom w:val="single" w:sz="8" w:space="0" w:color="000000"/>
               <w:right w:val="nil"/>
@@ -2120,7 +2120,7 @@
           <w:tcPr>
             <w:tcW w:type="dxa" w:w="1284"/>
             <w:tcBorders>
-              <w:top w:val="single" w:sz="8" w:space="0" w:color="000000"/>
+              <w:top w:val="single" w:sz="18" w:space="0" w:color="000000"/>
               <w:left w:val="nil"/>
               <w:bottom w:val="single" w:sz="8" w:space="0" w:color="000000"/>
               <w:right w:val="nil"/>
@@ -3537,7 +3537,7 @@
             <w:tcBorders>
               <w:top w:val="nil"/>
               <w:left w:val="nil"/>
-              <w:bottom w:val="single" w:sz="8" w:space="0" w:color="000000"/>
+              <w:bottom w:val="single" w:sz="18" w:space="0" w:color="000000"/>
               <w:right w:val="nil"/>
             </w:tcBorders>
             <w:vAlign w:val="top"/>
@@ -3564,7 +3564,7 @@
             <w:tcBorders>
               <w:top w:val="nil"/>
               <w:left w:val="nil"/>
-              <w:bottom w:val="single" w:sz="8" w:space="0" w:color="000000"/>
+              <w:bottom w:val="single" w:sz="18" w:space="0" w:color="000000"/>
               <w:right w:val="nil"/>
             </w:tcBorders>
             <w:vAlign w:val="top"/>
@@ -3591,7 +3591,7 @@
             <w:tcBorders>
               <w:top w:val="nil"/>
               <w:left w:val="nil"/>
-              <w:bottom w:val="single" w:sz="8" w:space="0" w:color="000000"/>
+              <w:bottom w:val="single" w:sz="18" w:space="0" w:color="000000"/>
               <w:right w:val="nil"/>
             </w:tcBorders>
             <w:vAlign w:val="top"/>
@@ -3618,7 +3618,7 @@
             <w:tcBorders>
               <w:top w:val="nil"/>
               <w:left w:val="nil"/>
-              <w:bottom w:val="single" w:sz="8" w:space="0" w:color="000000"/>
+              <w:bottom w:val="single" w:sz="18" w:space="0" w:color="000000"/>
               <w:right w:val="nil"/>
             </w:tcBorders>
             <w:vAlign w:val="top"/>
@@ -3645,7 +3645,7 @@
             <w:tcBorders>
               <w:top w:val="nil"/>
               <w:left w:val="nil"/>
-              <w:bottom w:val="single" w:sz="8" w:space="0" w:color="000000"/>
+              <w:bottom w:val="single" w:sz="18" w:space="0" w:color="000000"/>
               <w:right w:val="nil"/>
             </w:tcBorders>
             <w:vAlign w:val="top"/>
@@ -3672,7 +3672,7 @@
             <w:tcBorders>
               <w:top w:val="nil"/>
               <w:left w:val="nil"/>
-              <w:bottom w:val="single" w:sz="8" w:space="0" w:color="000000"/>
+              <w:bottom w:val="single" w:sz="18" w:space="0" w:color="000000"/>
               <w:right w:val="nil"/>
             </w:tcBorders>
             <w:vAlign w:val="top"/>
@@ -3699,7 +3699,7 @@
             <w:tcBorders>
               <w:top w:val="nil"/>
               <w:left w:val="nil"/>
-              <w:bottom w:val="single" w:sz="8" w:space="0" w:color="000000"/>
+              <w:bottom w:val="single" w:sz="18" w:space="0" w:color="000000"/>
               <w:right w:val="nil"/>
             </w:tcBorders>
             <w:vAlign w:val="top"/>
@@ -3726,7 +3726,7 @@
             <w:tcBorders>
               <w:top w:val="nil"/>
               <w:left w:val="nil"/>
-              <w:bottom w:val="single" w:sz="8" w:space="0" w:color="000000"/>
+              <w:bottom w:val="single" w:sz="18" w:space="0" w:color="000000"/>
               <w:right w:val="nil"/>
             </w:tcBorders>
             <w:vAlign w:val="top"/>
@@ -3753,7 +3753,7 @@
             <w:tcBorders>
               <w:top w:val="nil"/>
               <w:left w:val="nil"/>
-              <w:bottom w:val="single" w:sz="8" w:space="0" w:color="000000"/>
+              <w:bottom w:val="single" w:sz="18" w:space="0" w:color="000000"/>
               <w:right w:val="nil"/>
             </w:tcBorders>
             <w:vAlign w:val="top"/>
@@ -3780,7 +3780,7 @@
             <w:tcBorders>
               <w:top w:val="nil"/>
               <w:left w:val="nil"/>
-              <w:bottom w:val="single" w:sz="8" w:space="0" w:color="000000"/>
+              <w:bottom w:val="single" w:sz="18" w:space="0" w:color="000000"/>
               <w:right w:val="nil"/>
             </w:tcBorders>
             <w:vAlign w:val="top"/>
@@ -3862,7 +3862,7 @@
           <w:tcPr>
             <w:tcW w:type="dxa" w:w="3152"/>
             <w:tcBorders>
-              <w:top w:val="single" w:sz="8" w:space="0" w:color="000000"/>
+              <w:top w:val="single" w:sz="18" w:space="0" w:color="000000"/>
               <w:left w:val="nil"/>
               <w:bottom w:val="single" w:sz="8" w:space="0" w:color="000000"/>
               <w:right w:val="nil"/>
@@ -3889,7 +3889,7 @@
           <w:tcPr>
             <w:tcW w:type="dxa" w:w="2338"/>
             <w:tcBorders>
-              <w:top w:val="single" w:sz="8" w:space="0" w:color="000000"/>
+              <w:top w:val="single" w:sz="18" w:space="0" w:color="000000"/>
               <w:left w:val="nil"/>
               <w:bottom w:val="single" w:sz="8" w:space="0" w:color="000000"/>
               <w:right w:val="nil"/>
@@ -3916,7 +3916,7 @@
           <w:tcPr>
             <w:tcW w:type="dxa" w:w="910"/>
             <w:tcBorders>
-              <w:top w:val="single" w:sz="8" w:space="0" w:color="000000"/>
+              <w:top w:val="single" w:sz="18" w:space="0" w:color="000000"/>
               <w:left w:val="nil"/>
               <w:bottom w:val="single" w:sz="8" w:space="0" w:color="000000"/>
               <w:right w:val="nil"/>
@@ -3943,7 +3943,7 @@
           <w:tcPr>
             <w:tcW w:type="dxa" w:w="1241"/>
             <w:tcBorders>
-              <w:top w:val="single" w:sz="8" w:space="0" w:color="000000"/>
+              <w:top w:val="single" w:sz="18" w:space="0" w:color="000000"/>
               <w:left w:val="nil"/>
               <w:bottom w:val="single" w:sz="8" w:space="0" w:color="000000"/>
               <w:right w:val="nil"/>
@@ -3970,7 +3970,7 @@
           <w:tcPr>
             <w:tcW w:type="dxa" w:w="1040"/>
             <w:tcBorders>
-              <w:top w:val="single" w:sz="8" w:space="0" w:color="000000"/>
+              <w:top w:val="single" w:sz="18" w:space="0" w:color="000000"/>
               <w:left w:val="nil"/>
               <w:bottom w:val="single" w:sz="8" w:space="0" w:color="000000"/>
               <w:right w:val="nil"/>
@@ -4006,7 +4006,7 @@
           <w:tcPr>
             <w:tcW w:type="dxa" w:w="651"/>
             <w:tcBorders>
-              <w:top w:val="single" w:sz="8" w:space="0" w:color="000000"/>
+              <w:top w:val="single" w:sz="18" w:space="0" w:color="000000"/>
               <w:left w:val="nil"/>
               <w:bottom w:val="single" w:sz="8" w:space="0" w:color="000000"/>
               <w:right w:val="nil"/>
@@ -4042,7 +4042,7 @@
           <w:tcPr>
             <w:tcW w:type="dxa" w:w="706"/>
             <w:tcBorders>
-              <w:top w:val="single" w:sz="8" w:space="0" w:color="000000"/>
+              <w:top w:val="single" w:sz="18" w:space="0" w:color="000000"/>
               <w:left w:val="nil"/>
               <w:bottom w:val="single" w:sz="8" w:space="0" w:color="000000"/>
               <w:right w:val="nil"/>
@@ -4069,7 +4069,7 @@
           <w:tcPr>
             <w:tcW w:type="dxa" w:w="1136"/>
             <w:tcBorders>
-              <w:top w:val="single" w:sz="8" w:space="0" w:color="000000"/>
+              <w:top w:val="single" w:sz="18" w:space="0" w:color="000000"/>
               <w:left w:val="nil"/>
               <w:bottom w:val="single" w:sz="8" w:space="0" w:color="000000"/>
               <w:right w:val="nil"/>
@@ -4096,7 +4096,7 @@
           <w:tcPr>
             <w:tcW w:type="dxa" w:w="928"/>
             <w:tcBorders>
-              <w:top w:val="single" w:sz="8" w:space="0" w:color="000000"/>
+              <w:top w:val="single" w:sz="18" w:space="0" w:color="000000"/>
               <w:left w:val="nil"/>
               <w:bottom w:val="single" w:sz="8" w:space="0" w:color="000000"/>
               <w:right w:val="nil"/>
@@ -4123,7 +4123,7 @@
           <w:tcPr>
             <w:tcW w:type="dxa" w:w="858"/>
             <w:tcBorders>
-              <w:top w:val="single" w:sz="8" w:space="0" w:color="000000"/>
+              <w:top w:val="single" w:sz="18" w:space="0" w:color="000000"/>
               <w:left w:val="nil"/>
               <w:bottom w:val="single" w:sz="8" w:space="0" w:color="000000"/>
               <w:right w:val="nil"/>
@@ -6456,7 +6456,7 @@
             <w:tcBorders>
               <w:top w:val="nil"/>
               <w:left w:val="nil"/>
-              <w:bottom w:val="single" w:sz="8" w:space="0" w:color="000000"/>
+              <w:bottom w:val="single" w:sz="18" w:space="0" w:color="000000"/>
               <w:right w:val="nil"/>
             </w:tcBorders>
             <w:vAlign w:val="top"/>
@@ -6484,7 +6484,7 @@
             <w:tcBorders>
               <w:top w:val="nil"/>
               <w:left w:val="nil"/>
-              <w:bottom w:val="single" w:sz="8" w:space="0" w:color="000000"/>
+              <w:bottom w:val="single" w:sz="18" w:space="0" w:color="000000"/>
               <w:right w:val="nil"/>
             </w:tcBorders>
             <w:vAlign w:val="top"/>
@@ -6503,7 +6503,7 @@
             <w:tcBorders>
               <w:top w:val="nil"/>
               <w:left w:val="nil"/>
-              <w:bottom w:val="single" w:sz="8" w:space="0" w:color="000000"/>
+              <w:bottom w:val="single" w:sz="18" w:space="0" w:color="000000"/>
               <w:right w:val="nil"/>
             </w:tcBorders>
             <w:vAlign w:val="top"/>
@@ -6530,7 +6530,7 @@
             <w:tcBorders>
               <w:top w:val="nil"/>
               <w:left w:val="nil"/>
-              <w:bottom w:val="single" w:sz="8" w:space="0" w:color="000000"/>
+              <w:bottom w:val="single" w:sz="18" w:space="0" w:color="000000"/>
               <w:right w:val="nil"/>
             </w:tcBorders>
             <w:vAlign w:val="top"/>
@@ -6557,7 +6557,7 @@
             <w:tcBorders>
               <w:top w:val="nil"/>
               <w:left w:val="nil"/>
-              <w:bottom w:val="single" w:sz="8" w:space="0" w:color="000000"/>
+              <w:bottom w:val="single" w:sz="18" w:space="0" w:color="000000"/>
               <w:right w:val="nil"/>
             </w:tcBorders>
             <w:vAlign w:val="top"/>
@@ -6576,7 +6576,7 @@
             <w:tcBorders>
               <w:top w:val="nil"/>
               <w:left w:val="nil"/>
-              <w:bottom w:val="single" w:sz="8" w:space="0" w:color="000000"/>
+              <w:bottom w:val="single" w:sz="18" w:space="0" w:color="000000"/>
               <w:right w:val="nil"/>
             </w:tcBorders>
             <w:vAlign w:val="top"/>
@@ -6595,7 +6595,7 @@
             <w:tcBorders>
               <w:top w:val="nil"/>
               <w:left w:val="nil"/>
-              <w:bottom w:val="single" w:sz="8" w:space="0" w:color="000000"/>
+              <w:bottom w:val="single" w:sz="18" w:space="0" w:color="000000"/>
               <w:right w:val="nil"/>
             </w:tcBorders>
             <w:vAlign w:val="top"/>
@@ -6614,7 +6614,7 @@
             <w:tcBorders>
               <w:top w:val="nil"/>
               <w:left w:val="nil"/>
-              <w:bottom w:val="single" w:sz="8" w:space="0" w:color="000000"/>
+              <w:bottom w:val="single" w:sz="18" w:space="0" w:color="000000"/>
               <w:right w:val="nil"/>
             </w:tcBorders>
             <w:vAlign w:val="top"/>
@@ -6633,7 +6633,7 @@
             <w:tcBorders>
               <w:top w:val="nil"/>
               <w:left w:val="nil"/>
-              <w:bottom w:val="single" w:sz="8" w:space="0" w:color="000000"/>
+              <w:bottom w:val="single" w:sz="18" w:space="0" w:color="000000"/>
               <w:right w:val="nil"/>
             </w:tcBorders>
             <w:vAlign w:val="top"/>
@@ -6660,7 +6660,7 @@
             <w:tcBorders>
               <w:top w:val="nil"/>
               <w:left w:val="nil"/>
-              <w:bottom w:val="single" w:sz="8" w:space="0" w:color="000000"/>
+              <w:bottom w:val="single" w:sz="18" w:space="0" w:color="000000"/>
               <w:right w:val="nil"/>
             </w:tcBorders>
             <w:vAlign w:val="top"/>
@@ -6738,7 +6738,7 @@
           <w:tcPr>
             <w:tcW w:type="dxa" w:w="2360"/>
             <w:tcBorders>
-              <w:top w:val="single" w:sz="8" w:space="0" w:color="000000"/>
+              <w:top w:val="single" w:sz="18" w:space="0" w:color="000000"/>
               <w:left w:val="nil"/>
               <w:bottom w:val="single" w:sz="8" w:space="0" w:color="000000"/>
               <w:right w:val="nil"/>
@@ -6757,7 +6757,7 @@
           <w:tcPr>
             <w:tcW w:type="dxa" w:w="1419"/>
             <w:tcBorders>
-              <w:top w:val="single" w:sz="8" w:space="0" w:color="000000"/>
+              <w:top w:val="single" w:sz="18" w:space="0" w:color="000000"/>
               <w:left w:val="nil"/>
               <w:bottom w:val="single" w:sz="8" w:space="0" w:color="000000"/>
               <w:right w:val="nil"/>
@@ -6795,7 +6795,7 @@
           <w:tcPr>
             <w:tcW w:type="dxa" w:w="1428"/>
             <w:tcBorders>
-              <w:top w:val="single" w:sz="8" w:space="0" w:color="000000"/>
+              <w:top w:val="single" w:sz="18" w:space="0" w:color="000000"/>
               <w:left w:val="nil"/>
               <w:bottom w:val="single" w:sz="8" w:space="0" w:color="000000"/>
               <w:right w:val="nil"/>
@@ -6833,7 +6833,7 @@
           <w:tcPr>
             <w:tcW w:type="dxa" w:w="1419"/>
             <w:tcBorders>
-              <w:top w:val="single" w:sz="8" w:space="0" w:color="000000"/>
+              <w:top w:val="single" w:sz="18" w:space="0" w:color="000000"/>
               <w:left w:val="nil"/>
               <w:bottom w:val="single" w:sz="8" w:space="0" w:color="000000"/>
               <w:right w:val="nil"/>
@@ -6871,7 +6871,7 @@
           <w:tcPr>
             <w:tcW w:type="dxa" w:w="1428"/>
             <w:tcBorders>
-              <w:top w:val="single" w:sz="8" w:space="0" w:color="000000"/>
+              <w:top w:val="single" w:sz="18" w:space="0" w:color="000000"/>
               <w:left w:val="nil"/>
               <w:bottom w:val="single" w:sz="8" w:space="0" w:color="000000"/>
               <w:right w:val="nil"/>
@@ -6909,7 +6909,7 @@
           <w:tcPr>
             <w:tcW w:type="dxa" w:w="1306"/>
             <w:tcBorders>
-              <w:top w:val="single" w:sz="8" w:space="0" w:color="000000"/>
+              <w:top w:val="single" w:sz="18" w:space="0" w:color="000000"/>
               <w:left w:val="nil"/>
               <w:bottom w:val="single" w:sz="8" w:space="0" w:color="000000"/>
               <w:right w:val="nil"/>
@@ -9332,7 +9332,7 @@
             <w:tcBorders>
               <w:top w:val="nil"/>
               <w:left w:val="nil"/>
-              <w:bottom w:val="single" w:sz="8" w:space="0" w:color="000000"/>
+              <w:bottom w:val="single" w:sz="18" w:space="0" w:color="000000"/>
               <w:right w:val="nil"/>
             </w:tcBorders>
             <w:vAlign w:val="top"/>
@@ -9359,7 +9359,7 @@
             <w:tcBorders>
               <w:top w:val="nil"/>
               <w:left w:val="nil"/>
-              <w:bottom w:val="single" w:sz="8" w:space="0" w:color="000000"/>
+              <w:bottom w:val="single" w:sz="18" w:space="0" w:color="000000"/>
               <w:right w:val="nil"/>
             </w:tcBorders>
             <w:vAlign w:val="top"/>
@@ -9386,7 +9386,7 @@
             <w:tcBorders>
               <w:top w:val="nil"/>
               <w:left w:val="nil"/>
-              <w:bottom w:val="single" w:sz="8" w:space="0" w:color="000000"/>
+              <w:bottom w:val="single" w:sz="18" w:space="0" w:color="000000"/>
               <w:right w:val="nil"/>
             </w:tcBorders>
             <w:vAlign w:val="top"/>
@@ -9413,7 +9413,7 @@
             <w:tcBorders>
               <w:top w:val="nil"/>
               <w:left w:val="nil"/>
-              <w:bottom w:val="single" w:sz="8" w:space="0" w:color="000000"/>
+              <w:bottom w:val="single" w:sz="18" w:space="0" w:color="000000"/>
               <w:right w:val="nil"/>
             </w:tcBorders>
             <w:vAlign w:val="top"/>
@@ -9440,7 +9440,7 @@
             <w:tcBorders>
               <w:top w:val="nil"/>
               <w:left w:val="nil"/>
-              <w:bottom w:val="single" w:sz="8" w:space="0" w:color="000000"/>
+              <w:bottom w:val="single" w:sz="18" w:space="0" w:color="000000"/>
               <w:right w:val="nil"/>
             </w:tcBorders>
             <w:vAlign w:val="top"/>
@@ -9467,7 +9467,7 @@
             <w:tcBorders>
               <w:top w:val="nil"/>
               <w:left w:val="nil"/>
-              <w:bottom w:val="single" w:sz="8" w:space="0" w:color="000000"/>
+              <w:bottom w:val="single" w:sz="18" w:space="0" w:color="000000"/>
               <w:right w:val="nil"/>
             </w:tcBorders>
             <w:vAlign w:val="top"/>
@@ -9535,7 +9535,7 @@
           <w:tcPr>
             <w:tcW w:type="dxa" w:w="1972"/>
             <w:tcBorders>
-              <w:top w:val="single" w:sz="8" w:space="0" w:color="000000"/>
+              <w:top w:val="single" w:sz="18" w:space="0" w:color="000000"/>
               <w:left w:val="nil"/>
               <w:bottom w:val="single" w:sz="8" w:space="0" w:color="000000"/>
               <w:right w:val="nil"/>
@@ -9562,7 +9562,7 @@
           <w:tcPr>
             <w:tcW w:type="dxa" w:w="2607"/>
             <w:tcBorders>
-              <w:top w:val="single" w:sz="8" w:space="0" w:color="000000"/>
+              <w:top w:val="single" w:sz="18" w:space="0" w:color="000000"/>
               <w:left w:val="nil"/>
               <w:bottom w:val="single" w:sz="8" w:space="0" w:color="000000"/>
               <w:right w:val="nil"/>
@@ -9605,7 +9605,7 @@
           <w:tcPr>
             <w:tcW w:type="dxa" w:w="1761"/>
             <w:tcBorders>
-              <w:top w:val="single" w:sz="8" w:space="0" w:color="000000"/>
+              <w:top w:val="single" w:sz="18" w:space="0" w:color="000000"/>
               <w:left w:val="nil"/>
               <w:bottom w:val="single" w:sz="8" w:space="0" w:color="000000"/>
               <w:right w:val="nil"/>
@@ -9632,7 +9632,7 @@
           <w:tcPr>
             <w:tcW w:type="dxa" w:w="3020"/>
             <w:tcBorders>
-              <w:top w:val="single" w:sz="8" w:space="0" w:color="000000"/>
+              <w:top w:val="single" w:sz="18" w:space="0" w:color="000000"/>
               <w:left w:val="nil"/>
               <w:bottom w:val="single" w:sz="8" w:space="0" w:color="000000"/>
               <w:right w:val="nil"/>
@@ -10231,7 +10231,7 @@
             <w:tcBorders>
               <w:top w:val="nil"/>
               <w:left w:val="nil"/>
-              <w:bottom w:val="single" w:sz="8" w:space="0" w:color="000000"/>
+              <w:bottom w:val="single" w:sz="18" w:space="0" w:color="000000"/>
               <w:right w:val="nil"/>
             </w:tcBorders>
             <w:vAlign w:val="top"/>
@@ -10258,7 +10258,7 @@
             <w:tcBorders>
               <w:top w:val="nil"/>
               <w:left w:val="nil"/>
-              <w:bottom w:val="single" w:sz="8" w:space="0" w:color="000000"/>
+              <w:bottom w:val="single" w:sz="18" w:space="0" w:color="000000"/>
               <w:right w:val="nil"/>
             </w:tcBorders>
             <w:vAlign w:val="top"/>
@@ -10285,7 +10285,7 @@
             <w:tcBorders>
               <w:top w:val="nil"/>
               <w:left w:val="nil"/>
-              <w:bottom w:val="single" w:sz="8" w:space="0" w:color="000000"/>
+              <w:bottom w:val="single" w:sz="18" w:space="0" w:color="000000"/>
               <w:right w:val="nil"/>
             </w:tcBorders>
             <w:vAlign w:val="top"/>
@@ -10312,7 +10312,7 @@
             <w:tcBorders>
               <w:top w:val="nil"/>
               <w:left w:val="nil"/>
-              <w:bottom w:val="single" w:sz="8" w:space="0" w:color="000000"/>
+              <w:bottom w:val="single" w:sz="18" w:space="0" w:color="000000"/>
               <w:right w:val="nil"/>
             </w:tcBorders>
             <w:vAlign w:val="top"/>
@@ -10389,7 +10389,7 @@
           <w:tcPr>
             <w:tcW w:type="dxa" w:w="3877"/>
             <w:tcBorders>
-              <w:top w:val="single" w:sz="8" w:space="0" w:color="000000"/>
+              <w:top w:val="single" w:sz="18" w:space="0" w:color="000000"/>
               <w:left w:val="nil"/>
               <w:bottom w:val="single" w:sz="8" w:space="0" w:color="000000"/>
               <w:right w:val="nil"/>
@@ -10416,7 +10416,7 @@
           <w:tcPr>
             <w:tcW w:type="dxa" w:w="1258"/>
             <w:tcBorders>
-              <w:top w:val="single" w:sz="8" w:space="0" w:color="000000"/>
+              <w:top w:val="single" w:sz="18" w:space="0" w:color="000000"/>
               <w:left w:val="nil"/>
               <w:bottom w:val="single" w:sz="8" w:space="0" w:color="000000"/>
               <w:right w:val="nil"/>
@@ -10443,7 +10443,7 @@
           <w:tcPr>
             <w:tcW w:type="dxa" w:w="1535"/>
             <w:tcBorders>
-              <w:top w:val="single" w:sz="8" w:space="0" w:color="000000"/>
+              <w:top w:val="single" w:sz="18" w:space="0" w:color="000000"/>
               <w:left w:val="nil"/>
               <w:bottom w:val="single" w:sz="8" w:space="0" w:color="000000"/>
               <w:right w:val="nil"/>
@@ -10470,7 +10470,7 @@
           <w:tcPr>
             <w:tcW w:type="dxa" w:w="1334"/>
             <w:tcBorders>
-              <w:top w:val="single" w:sz="8" w:space="0" w:color="000000"/>
+              <w:top w:val="single" w:sz="18" w:space="0" w:color="000000"/>
               <w:left w:val="nil"/>
               <w:bottom w:val="single" w:sz="8" w:space="0" w:color="000000"/>
               <w:right w:val="nil"/>
@@ -10506,7 +10506,7 @@
           <w:tcPr>
             <w:tcW w:type="dxa" w:w="1356"/>
             <w:tcBorders>
-              <w:top w:val="single" w:sz="8" w:space="0" w:color="000000"/>
+              <w:top w:val="single" w:sz="18" w:space="0" w:color="000000"/>
               <w:left w:val="nil"/>
               <w:bottom w:val="single" w:sz="8" w:space="0" w:color="000000"/>
               <w:right w:val="nil"/>
@@ -11660,7 +11660,7 @@
             <w:tcBorders>
               <w:top w:val="nil"/>
               <w:left w:val="nil"/>
-              <w:bottom w:val="single" w:sz="8" w:space="0" w:color="000000"/>
+              <w:bottom w:val="single" w:sz="18" w:space="0" w:color="000000"/>
               <w:right w:val="nil"/>
             </w:tcBorders>
             <w:vAlign w:val="top"/>
@@ -11687,7 +11687,7 @@
             <w:tcBorders>
               <w:top w:val="nil"/>
               <w:left w:val="nil"/>
-              <w:bottom w:val="single" w:sz="8" w:space="0" w:color="000000"/>
+              <w:bottom w:val="single" w:sz="18" w:space="0" w:color="000000"/>
               <w:right w:val="nil"/>
             </w:tcBorders>
             <w:vAlign w:val="top"/>
@@ -11714,7 +11714,7 @@
             <w:tcBorders>
               <w:top w:val="nil"/>
               <w:left w:val="nil"/>
-              <w:bottom w:val="single" w:sz="8" w:space="0" w:color="000000"/>
+              <w:bottom w:val="single" w:sz="18" w:space="0" w:color="000000"/>
               <w:right w:val="nil"/>
             </w:tcBorders>
             <w:vAlign w:val="top"/>
@@ -11741,7 +11741,7 @@
             <w:tcBorders>
               <w:top w:val="nil"/>
               <w:left w:val="nil"/>
-              <w:bottom w:val="single" w:sz="8" w:space="0" w:color="000000"/>
+              <w:bottom w:val="single" w:sz="18" w:space="0" w:color="000000"/>
               <w:right w:val="nil"/>
             </w:tcBorders>
             <w:vAlign w:val="top"/>
@@ -11768,7 +11768,7 @@
             <w:tcBorders>
               <w:top w:val="nil"/>
               <w:left w:val="nil"/>
-              <w:bottom w:val="single" w:sz="8" w:space="0" w:color="000000"/>
+              <w:bottom w:val="single" w:sz="18" w:space="0" w:color="000000"/>
               <w:right w:val="nil"/>
             </w:tcBorders>
             <w:vAlign w:val="top"/>

</xml_diff>